<commit_message>
Remove leftover files from disk
</commit_message>
<xml_diff>
--- a/STRIDE.docx
+++ b/STRIDE.docx
@@ -50,19 +50,31 @@
           <w:tcPr>
             <w:tcW w:w="3116" w:type="dxa"/>
           </w:tcPr>
-          <w:p/>
+          <w:p>
+            <w:r>
+              <w:t>User can check the details of other users orders.</w:t>
+            </w:r>
+          </w:p>
         </w:tc>
         <w:tc>
           <w:tcPr>
             <w:tcW w:w="3117" w:type="dxa"/>
           </w:tcPr>
-          <w:p/>
+          <w:p>
+            <w:r>
+              <w:t>HIgh</w:t>
+            </w:r>
+          </w:p>
         </w:tc>
         <w:tc>
           <w:tcPr>
             <w:tcW w:w="3117" w:type="dxa"/>
           </w:tcPr>
-          <w:p/>
+          <w:p>
+            <w:r>
+              <w:t>/order/&lt;id?</w:t>
+            </w:r>
+          </w:p>
         </w:tc>
       </w:tr>
       <w:tr>
@@ -70,19 +82,31 @@
           <w:tcPr>
             <w:tcW w:w="3116" w:type="dxa"/>
           </w:tcPr>
-          <w:p/>
+          <w:p>
+            <w:r>
+              <w:t>Non admin users can see the details of id pass of other of users</w:t>
+            </w:r>
+          </w:p>
         </w:tc>
         <w:tc>
           <w:tcPr>
             <w:tcW w:w="3117" w:type="dxa"/>
           </w:tcPr>
-          <w:p/>
+          <w:p>
+            <w:r>
+              <w:t>high</w:t>
+            </w:r>
+          </w:p>
         </w:tc>
         <w:tc>
           <w:tcPr>
             <w:tcW w:w="3117" w:type="dxa"/>
           </w:tcPr>
-          <w:p/>
+          <w:p>
+            <w:r>
+              <w:t>/admin/users</w:t>
+            </w:r>
+          </w:p>
         </w:tc>
       </w:tr>
       <w:tr>
@@ -90,19 +114,31 @@
           <w:tcPr>
             <w:tcW w:w="3116" w:type="dxa"/>
           </w:tcPr>
-          <w:p/>
+          <w:p>
+            <w:r>
+              <w:t>SQL injection</w:t>
+            </w:r>
+          </w:p>
         </w:tc>
         <w:tc>
           <w:tcPr>
             <w:tcW w:w="3117" w:type="dxa"/>
           </w:tcPr>
-          <w:p/>
+          <w:p>
+            <w:r>
+              <w:t>medium</w:t>
+            </w:r>
+          </w:p>
         </w:tc>
         <w:tc>
           <w:tcPr>
             <w:tcW w:w="3117" w:type="dxa"/>
           </w:tcPr>
-          <w:p/>
+          <w:p>
+            <w:r>
+              <w:t>/products/search</w:t>
+            </w:r>
+          </w:p>
         </w:tc>
       </w:tr>
       <w:tr>
@@ -110,19 +146,31 @@
           <w:tcPr>
             <w:tcW w:w="3116" w:type="dxa"/>
           </w:tcPr>
-          <w:p/>
+          <w:p>
+            <w:r>
+              <w:t>No rate limiting</w:t>
+            </w:r>
+          </w:p>
         </w:tc>
         <w:tc>
           <w:tcPr>
             <w:tcW w:w="3117" w:type="dxa"/>
           </w:tcPr>
-          <w:p/>
+          <w:p>
+            <w:r>
+              <w:t>medium</w:t>
+            </w:r>
+          </w:p>
         </w:tc>
         <w:tc>
           <w:tcPr>
             <w:tcW w:w="3117" w:type="dxa"/>
           </w:tcPr>
-          <w:p/>
+          <w:p>
+            <w:r>
+              <w:t>/login</w:t>
+            </w:r>
+          </w:p>
         </w:tc>
       </w:tr>
       <w:tr>
@@ -130,19 +178,31 @@
           <w:tcPr>
             <w:tcW w:w="3116" w:type="dxa"/>
           </w:tcPr>
-          <w:p/>
+          <w:p>
+            <w:r>
+              <w:t>No logging</w:t>
+            </w:r>
+          </w:p>
         </w:tc>
         <w:tc>
           <w:tcPr>
             <w:tcW w:w="3117" w:type="dxa"/>
           </w:tcPr>
-          <w:p/>
+          <w:p>
+            <w:r>
+              <w:t>low</w:t>
+            </w:r>
+          </w:p>
         </w:tc>
         <w:tc>
           <w:tcPr>
             <w:tcW w:w="3117" w:type="dxa"/>
           </w:tcPr>
-          <w:p/>
+          <w:p>
+            <w:r>
+              <w:t>All apis</w:t>
+            </w:r>
+          </w:p>
         </w:tc>
       </w:tr>
     </w:tbl>

</xml_diff>